<commit_message>
new changes in the strucure of the files
</commit_message>
<xml_diff>
--- a/01_TaskFlow_Project_Planning_and_Management.docx
+++ b/01_TaskFlow_Project_Planning_and_Management.docx
@@ -10,7 +10,7 @@
         <w:rPr>
           <w:b/>
           <w:color w:val="1F4E79"/>
-          <w:sz w:val="44"/>
+          <w:sz w:val="46"/>
         </w:rPr>
         <w:t>TaskFlow</w:t>
       </w:r>
@@ -21,10 +21,10 @@
       </w:pPr>
       <w:r>
         <w:rPr>
-          <w:i/>
-          <w:sz w:val="22"/>
+          <w:b/>
+          <w:sz w:val="28"/>
         </w:rPr>
-        <w:t>Project Planning &amp; Management</w:t>
+        <w:t>1. Project Planning &amp; Management</w:t>
       </w:r>
     </w:p>
     <w:p>
@@ -33,14 +33,14 @@
       </w:pPr>
       <w:r>
         <w:rPr>
-          <w:b/>
+          <w:i/>
         </w:rPr>
         <w:t>DEPI Project 4 | Draft for team review</w:t>
       </w:r>
     </w:p>
     <w:p>
       <w:r>
-        <w:t>Document status: Draft. Replace bracketed placeholders with the team’s actual details and confirm any updated submission dates with the DEPI supervisor.</w:t>
+        <w:t>Prepared for review. Replace bracketed placeholders with confirmed team information. Do not treat proposed dates or roles as official until agreed with the team and supervisor.</w:t>
       </w:r>
     </w:p>
     <w:p>
@@ -48,12 +48,158 @@
         <w:pStyle w:val="Heading1"/>
       </w:pPr>
       <w:r>
-        <w:t>1. Project Overview</w:t>
+        <w:t>1.1 Project Proposal</w:t>
+      </w:r>
+    </w:p>
+    <w:p>
+      <w:pPr>
+        <w:pStyle w:val="Heading2"/>
+      </w:pPr>
+      <w:r>
+        <w:t>Project Overview</w:t>
       </w:r>
     </w:p>
     <w:p>
       <w:r>
-        <w:t>TaskFlow is a web-based project and task management system designed to help teams organize work in shared workspaces, create projects, assign tasks, monitor progress, and collaborate through a common interface.</w:t>
+        <w:t>TaskFlow is a web-based project and task management system that helps teams organize projects, assign tasks, monitor progress, and collaborate through a shared workspace. It uses Kanban boards to visualize task status and is planned to support Gantt charts, notifications, and reporting as later features.</w:t>
+      </w:r>
+    </w:p>
+    <w:p>
+      <w:pPr>
+        <w:pStyle w:val="Heading2"/>
+      </w:pPr>
+      <w:r>
+        <w:t>Problem Statement</w:t>
+      </w:r>
+    </w:p>
+    <w:p>
+      <w:r>
+        <w:t>When project information, responsibilities, due dates, and discussions are spread across different tools, team members may find it difficult to see who is doing what and how much work remains. TaskFlow aims to centralize project and task information in one application.</w:t>
+      </w:r>
+    </w:p>
+    <w:p>
+      <w:pPr>
+        <w:pStyle w:val="Heading2"/>
+      </w:pPr>
+      <w:r>
+        <w:t>Objectives</w:t>
+      </w:r>
+    </w:p>
+    <w:p>
+      <w:pPr>
+        <w:pStyle w:val="ListBullet"/>
+      </w:pPr>
+      <w:r>
+        <w:t>Allow authorized users to create and manage workspaces, teams, and projects.</w:t>
+      </w:r>
+    </w:p>
+    <w:p>
+      <w:pPr>
+        <w:pStyle w:val="ListBullet"/>
+      </w:pPr>
+      <w:r>
+        <w:t>Allow users to create, assign, prioritize, and update tasks.</w:t>
+      </w:r>
+    </w:p>
+    <w:p>
+      <w:pPr>
+        <w:pStyle w:val="ListBullet"/>
+      </w:pPr>
+      <w:r>
+        <w:t>Show task progress using Kanban columns such as To Do, In Progress, Review, and Done.</w:t>
+      </w:r>
+    </w:p>
+    <w:p>
+      <w:pPr>
+        <w:pStyle w:val="ListBullet"/>
+      </w:pPr>
+      <w:r>
+        <w:t>Support collaboration through comments, activity history, and notifications.</w:t>
+      </w:r>
+    </w:p>
+    <w:p>
+      <w:pPr>
+        <w:pStyle w:val="ListBullet"/>
+      </w:pPr>
+      <w:r>
+        <w:t>Provide project progress reporting, with Gantt charts and time tracking planned as advanced features.</w:t>
+      </w:r>
+    </w:p>
+    <w:p>
+      <w:pPr>
+        <w:pStyle w:val="ListBullet"/>
+      </w:pPr>
+      <w:r>
+        <w:t>Use a maintainable ASP.NET Core architecture and document the implementation and testing.</w:t>
+      </w:r>
+    </w:p>
+    <w:p>
+      <w:pPr>
+        <w:pStyle w:val="Heading2"/>
+      </w:pPr>
+      <w:r>
+        <w:t>Project Scope</w:t>
+      </w:r>
+    </w:p>
+    <w:p>
+      <w:r>
+        <w:t>Initial scope (MVP): authentication, project management, task CRUD, task status/priority/due date/assignee, a basic Kanban board, and a simple progress dashboard. Advanced scope: SignalR real-time updates, comments and attachments, Gantt charts, time tracking, advanced analytics, automation, and Azure deployment. The team should confirm which advanced features are required for grading.</w:t>
+      </w:r>
+    </w:p>
+    <w:p>
+      <w:pPr>
+        <w:pStyle w:val="Heading2"/>
+      </w:pPr>
+      <w:r>
+        <w:t>Proposed Technologies</w:t>
+      </w:r>
+    </w:p>
+    <w:p>
+      <w:pPr>
+        <w:pStyle w:val="ListBullet"/>
+      </w:pPr>
+      <w:r>
+        <w:t>ASP.NET Core MVC and C# for the web application.</w:t>
+      </w:r>
+    </w:p>
+    <w:p>
+      <w:pPr>
+        <w:pStyle w:val="ListBullet"/>
+      </w:pPr>
+      <w:r>
+        <w:t>Entity Framework Core and SQL Server for data persistence.</w:t>
+      </w:r>
+    </w:p>
+    <w:p>
+      <w:pPr>
+        <w:pStyle w:val="ListBullet"/>
+      </w:pPr>
+      <w:r>
+        <w:t>ASP.NET Core Identity for authentication and authorization.</w:t>
+      </w:r>
+    </w:p>
+    <w:p>
+      <w:pPr>
+        <w:pStyle w:val="ListBullet"/>
+      </w:pPr>
+      <w:r>
+        <w:t>Bootstrap 5, HTML, CSS, and JavaScript for the user interface.</w:t>
+      </w:r>
+    </w:p>
+    <w:p>
+      <w:pPr>
+        <w:pStyle w:val="ListBullet"/>
+      </w:pPr>
+      <w:r>
+        <w:t>Dragula.js for drag-and-drop, SignalR for real-time updates, Frappe Gantt for Gantt charts, and Chart.js for charts when those features are implemented.</w:t>
+      </w:r>
+    </w:p>
+    <w:p>
+      <w:pPr>
+        <w:pStyle w:val="ListBullet"/>
+      </w:pPr>
+      <w:r>
+        <w:t>Git and GitHub for source control and team collaboration; Microsoft Azure for deployment if required and available.</w:t>
       </w:r>
     </w:p>
     <w:p>
@@ -61,334 +207,68 @@
         <w:pStyle w:val="Heading1"/>
       </w:pPr>
       <w:r>
-        <w:t>2. Problem Statement</w:t>
+        <w:t>1.2 Project Plan — Timeline, Milestones, Deliverables, and Resources</w:t>
       </w:r>
     </w:p>
     <w:p>
       <w:r>
-        <w:t>Teams can lose visibility of responsibilities and progress when tasks, due dates, discussions, and status updates are spread across different tools. TaskFlow proposes a centralized workspace where project information and task progress can be tracked consistently.</w:t>
-      </w:r>
-    </w:p>
-    <w:p>
-      <w:pPr>
-        <w:pStyle w:val="Heading1"/>
-      </w:pPr>
-      <w:r>
-        <w:t>3. Objectives</w:t>
-      </w:r>
-    </w:p>
-    <w:p>
-      <w:pPr>
-        <w:pStyle w:val="ListBullet"/>
-      </w:pPr>
-      <w:r>
-        <w:t>Create and manage workspaces, teams, and projects.</w:t>
-      </w:r>
-    </w:p>
-    <w:p>
-      <w:pPr>
-        <w:pStyle w:val="ListBullet"/>
-      </w:pPr>
-      <w:r>
-        <w:t>Create, assign, prioritize, update, and track tasks.</w:t>
-      </w:r>
-    </w:p>
-    <w:p>
-      <w:pPr>
-        <w:pStyle w:val="ListBullet"/>
-      </w:pPr>
-      <w:r>
-        <w:t>Provide a Kanban board with configurable workflow columns.</w:t>
-      </w:r>
-    </w:p>
-    <w:p>
-      <w:pPr>
-        <w:pStyle w:val="ListBullet"/>
-      </w:pPr>
-      <w:r>
-        <w:t>Support collaboration through comments, notifications, and activity history.</w:t>
-      </w:r>
-    </w:p>
-    <w:p>
-      <w:pPr>
-        <w:pStyle w:val="ListBullet"/>
-      </w:pPr>
-      <w:r>
-        <w:t>Provide project progress reporting and, as an advanced feature, Gantt visualization and time tracking.</w:t>
-      </w:r>
-    </w:p>
-    <w:p>
-      <w:pPr>
-        <w:pStyle w:val="ListBullet"/>
-      </w:pPr>
-      <w:r>
-        <w:t>Use a layered ASP.NET Core architecture with maintainable data access and testable business logic.</w:t>
-      </w:r>
-    </w:p>
-    <w:p>
-      <w:pPr>
-        <w:pStyle w:val="ListBullet"/>
-      </w:pPr>
-      <w:r>
-        <w:t>Deliver source code, testing evidence, technical documentation, a user guide, and a demonstration/deployment link if available.</w:t>
-      </w:r>
-    </w:p>
-    <w:p>
-      <w:pPr>
-        <w:pStyle w:val="Heading1"/>
-      </w:pPr>
-      <w:r>
-        <w:t>4. Scope</w:t>
-      </w:r>
-    </w:p>
-    <w:p>
-      <w:pPr>
-        <w:pStyle w:val="Heading2"/>
-      </w:pPr>
-      <w:r>
-        <w:t>4.1 Minimum Viable Product (MVP)</w:t>
-      </w:r>
-    </w:p>
-    <w:p>
-      <w:pPr>
-        <w:pStyle w:val="ListBullet"/>
-      </w:pPr>
-      <w:r>
-        <w:t>Basic user authentication and role-based access.</w:t>
-      </w:r>
-    </w:p>
-    <w:p>
-      <w:pPr>
-        <w:pStyle w:val="ListBullet"/>
-      </w:pPr>
-      <w:r>
-        <w:t>Create, view, edit, and archive projects.</w:t>
-      </w:r>
-    </w:p>
-    <w:p>
-      <w:pPr>
-        <w:pStyle w:val="ListBullet"/>
-      </w:pPr>
-      <w:r>
-        <w:t>Create, edit, delete, and assign tasks.</w:t>
-      </w:r>
-    </w:p>
-    <w:p>
-      <w:pPr>
-        <w:pStyle w:val="ListBullet"/>
-      </w:pPr>
-      <w:r>
-        <w:t>Task status, priority, due date, and description.</w:t>
-      </w:r>
-    </w:p>
-    <w:p>
-      <w:pPr>
-        <w:pStyle w:val="ListBullet"/>
-      </w:pPr>
-      <w:r>
-        <w:t>Kanban columns and task movement between statuses.</w:t>
-      </w:r>
-    </w:p>
-    <w:p>
-      <w:pPr>
-        <w:pStyle w:val="ListBullet"/>
-      </w:pPr>
-      <w:r>
-        <w:t>Basic comments or activity history.</w:t>
-      </w:r>
-    </w:p>
-    <w:p>
-      <w:pPr>
-        <w:pStyle w:val="ListBullet"/>
-      </w:pPr>
-      <w:r>
-        <w:t>Basic dashboard showing task counts by status.</w:t>
-      </w:r>
-    </w:p>
-    <w:p>
-      <w:pPr>
-        <w:pStyle w:val="Heading2"/>
-      </w:pPr>
-      <w:r>
-        <w:t>4.2 Advanced Features (after MVP)</w:t>
-      </w:r>
-    </w:p>
-    <w:p>
-      <w:pPr>
-        <w:pStyle w:val="ListBullet"/>
-      </w:pPr>
-      <w:r>
-        <w:t>SignalR real-time updates and notification center.</w:t>
-      </w:r>
-    </w:p>
-    <w:p>
-      <w:pPr>
-        <w:pStyle w:val="ListBullet"/>
-      </w:pPr>
-      <w:r>
-        <w:t>File attachments, @mentions, and collaborative editing safeguards.</w:t>
-      </w:r>
-    </w:p>
-    <w:p>
-      <w:pPr>
-        <w:pStyle w:val="ListBullet"/>
-      </w:pPr>
-      <w:r>
-        <w:t>Gantt chart, dependencies, milestones, and critical path.</w:t>
-      </w:r>
-    </w:p>
-    <w:p>
-      <w:pPr>
-        <w:pStyle w:val="ListBullet"/>
-      </w:pPr>
-      <w:r>
-        <w:t>Time tracking, timesheets, and advanced analytics.</w:t>
-      </w:r>
-    </w:p>
-    <w:p>
-      <w:pPr>
-        <w:pStyle w:val="ListBullet"/>
-      </w:pPr>
-      <w:r>
-        <w:t>Search, saved filters, templates, automation rules, and admin panel.</w:t>
-      </w:r>
-    </w:p>
-    <w:p>
-      <w:pPr>
-        <w:pStyle w:val="ListBullet"/>
-      </w:pPr>
-      <w:r>
-        <w:t>Responsive/dark-mode UI, Azure deployment, monitoring, and CI/CD.</w:t>
-      </w:r>
-    </w:p>
-    <w:p>
-      <w:r>
-        <w:t>Scope control: advanced features must not delay a stable, tested MVP. The team should confirm the minimum required features with the supervisor.</w:t>
-      </w:r>
-    </w:p>
-    <w:p>
-      <w:pPr>
-        <w:pStyle w:val="Heading1"/>
-      </w:pPr>
-      <w:r>
-        <w:t>5. Proposed Technology Stack</w:t>
-      </w:r>
-    </w:p>
-    <w:p>
-      <w:pPr>
-        <w:pStyle w:val="ListBullet"/>
-      </w:pPr>
-      <w:r>
-        <w:t>Backend and web application: ASP.NET Core MVC (C#).</w:t>
-      </w:r>
-    </w:p>
-    <w:p>
-      <w:pPr>
-        <w:pStyle w:val="ListBullet"/>
-      </w:pPr>
-      <w:r>
-        <w:t>Data access: Entity Framework Core; SQL Server locally and Azure SQL for deployment if approved.</w:t>
-      </w:r>
-    </w:p>
-    <w:p>
-      <w:pPr>
-        <w:pStyle w:val="ListBullet"/>
-      </w:pPr>
-      <w:r>
-        <w:t>Authentication: ASP.NET Core Identity.</w:t>
-      </w:r>
-    </w:p>
-    <w:p>
-      <w:pPr>
-        <w:pStyle w:val="ListBullet"/>
-      </w:pPr>
-      <w:r>
-        <w:t>Architecture: TaskFlow.Web, TaskFlow.Services, and TaskFlow.Data.</w:t>
-      </w:r>
-    </w:p>
-    <w:p>
-      <w:pPr>
-        <w:pStyle w:val="ListBullet"/>
-      </w:pPr>
-      <w:r>
-        <w:t>UI: HTML, CSS, JavaScript, Bootstrap 5.</w:t>
-      </w:r>
-    </w:p>
-    <w:p>
-      <w:pPr>
-        <w:pStyle w:val="ListBullet"/>
-      </w:pPr>
-      <w:r>
-        <w:t>Interactive features: Dragula.js, SignalR, Frappe Gantt, and Chart.js as needed.</w:t>
-      </w:r>
-    </w:p>
-    <w:p>
-      <w:pPr>
-        <w:pStyle w:val="ListBullet"/>
-      </w:pPr>
-      <w:r>
-        <w:t>Version control and collaboration: Git and GitHub.</w:t>
-      </w:r>
-    </w:p>
-    <w:p>
-      <w:pPr>
-        <w:pStyle w:val="ListBullet"/>
-      </w:pPr>
-      <w:r>
-        <w:t>Cloud: Microsoft Azure for the deployment phase.</w:t>
-      </w:r>
-    </w:p>
-    <w:p>
-      <w:pPr>
-        <w:pStyle w:val="Heading1"/>
-      </w:pPr>
-      <w:r>
-        <w:t>6. Proposed Architecture and Design Patterns</w:t>
+        <w:t>The original schedule supplied by the team lists 16 October 2026 for the three early deliverables. As this date has passed, the dates below are a proposed working plan only and must be confirmed with the supervisor.</w:t>
       </w:r>
     </w:p>
     <w:tbl>
       <w:tblPr>
         <w:tblStyle w:val="TableGrid"/>
         <w:tblW w:type="auto" w:w="0"/>
-        <w:jc w:val="center"/>
         <w:tblLook w:firstColumn="1" w:firstRow="1" w:lastColumn="0" w:lastRow="0" w:noHBand="0" w:noVBand="1" w:val="04A0"/>
       </w:tblPr>
       <w:tblGrid>
-        <w:gridCol w:w="3360"/>
-        <w:gridCol w:w="3360"/>
-        <w:gridCol w:w="3360"/>
+        <w:gridCol w:w="2484"/>
+        <w:gridCol w:w="2484"/>
+        <w:gridCol w:w="2484"/>
+        <w:gridCol w:w="2484"/>
       </w:tblGrid>
       <w:tr>
         <w:tc>
           <w:tcPr>
-            <w:tcW w:type="dxa" w:w="3360"/>
+            <w:tcW w:type="dxa" w:w="2484"/>
             <w:shd w:fill="D9EAF7"/>
           </w:tcPr>
           <w:p>
             <w:r>
-              <w:t>Layer / Pattern</w:t>
+              <w:t>Milestone / work package</w:t>
             </w:r>
           </w:p>
         </w:tc>
         <w:tc>
           <w:tcPr>
-            <w:tcW w:type="dxa" w:w="3360"/>
+            <w:tcW w:type="dxa" w:w="2484"/>
             <w:shd w:fill="D9EAF7"/>
           </w:tcPr>
           <w:p>
             <w:r>
-              <w:t>Responsibility</w:t>
+              <w:t>Proposed timing</w:t>
             </w:r>
           </w:p>
         </w:tc>
         <w:tc>
           <w:tcPr>
-            <w:tcW w:type="dxa" w:w="3360"/>
+            <w:tcW w:type="dxa" w:w="2484"/>
             <w:shd w:fill="D9EAF7"/>
           </w:tcPr>
           <w:p>
             <w:r>
-              <w:t>Planned use</w:t>
+              <w:t>Deliverable</w:t>
+            </w:r>
+          </w:p>
+        </w:tc>
+        <w:tc>
+          <w:tcPr>
+            <w:tcW w:type="dxa" w:w="2484"/>
+            <w:shd w:fill="D9EAF7"/>
+          </w:tcPr>
+          <w:p>
+            <w:r>
+              <w:t>Resources / dependency</w:t>
             </w:r>
           </w:p>
         </w:tc>
@@ -396,31 +276,41 @@
       <w:tr>
         <w:tc>
           <w:tcPr>
-            <w:tcW w:type="dxa" w:w="3360"/>
+            <w:tcW w:type="dxa" w:w="2484"/>
           </w:tcPr>
           <w:p>
             <w:r>
-              <w:t>TaskFlow.Web</w:t>
+              <w:t>Project Planning &amp; Management</w:t>
             </w:r>
           </w:p>
         </w:tc>
         <w:tc>
           <w:tcPr>
-            <w:tcW w:type="dxa" w:w="3360"/>
+            <w:tcW w:type="dxa" w:w="2484"/>
           </w:tcPr>
           <w:p>
             <w:r>
-              <w:t>MVC controllers, views, input validation, presentation</w:t>
+              <w:t>17–18 Oct 2026 (proposed)</w:t>
             </w:r>
           </w:p>
         </w:tc>
         <w:tc>
           <w:tcPr>
-            <w:tcW w:type="dxa" w:w="3360"/>
+            <w:tcW w:type="dxa" w:w="2484"/>
           </w:tcPr>
           <w:p>
             <w:r>
-              <w:t>User-facing web application</w:t>
+              <w:t>Proposal, timeline, roles, risk plan, KPIs</w:t>
+            </w:r>
+          </w:p>
+        </w:tc>
+        <w:tc>
+          <w:tcPr>
+            <w:tcW w:type="dxa" w:w="2484"/>
+          </w:tcPr>
+          <w:p>
+            <w:r>
+              <w:t>Team meeting; confirm scope</w:t>
             </w:r>
           </w:p>
         </w:tc>
@@ -428,31 +318,41 @@
       <w:tr>
         <w:tc>
           <w:tcPr>
-            <w:tcW w:type="dxa" w:w="3360"/>
+            <w:tcW w:type="dxa" w:w="2484"/>
           </w:tcPr>
           <w:p>
             <w:r>
-              <w:t>TaskFlow.Services</w:t>
+              <w:t>Literature Review</w:t>
             </w:r>
           </w:p>
         </w:tc>
         <w:tc>
           <w:tcPr>
-            <w:tcW w:type="dxa" w:w="3360"/>
+            <w:tcW w:type="dxa" w:w="2484"/>
           </w:tcPr>
           <w:p>
             <w:r>
-              <w:t>Business rules and workflows</w:t>
+              <w:t>17–19 Oct 2026 (proposed)</w:t>
             </w:r>
           </w:p>
         </w:tc>
         <w:tc>
           <w:tcPr>
-            <w:tcW w:type="dxa" w:w="3360"/>
+            <w:tcW w:type="dxa" w:w="2484"/>
           </w:tcPr>
           <w:p>
             <w:r>
-              <w:t>Project/task operations and state transitions</w:t>
+              <w:t>Feedback/evaluation plan, suggested improvements, grading criteria notes</w:t>
+            </w:r>
+          </w:p>
+        </w:tc>
+        <w:tc>
+          <w:tcPr>
+            <w:tcW w:type="dxa" w:w="2484"/>
+          </w:tcPr>
+          <w:p>
+            <w:r>
+              <w:t>Project proposal; supervisor rubric</w:t>
             </w:r>
           </w:p>
         </w:tc>
@@ -460,31 +360,41 @@
       <w:tr>
         <w:tc>
           <w:tcPr>
-            <w:tcW w:type="dxa" w:w="3360"/>
+            <w:tcW w:type="dxa" w:w="2484"/>
           </w:tcPr>
           <w:p>
             <w:r>
-              <w:t>TaskFlow.Data</w:t>
+              <w:t>Requirements Gathering</w:t>
             </w:r>
           </w:p>
         </w:tc>
         <w:tc>
           <w:tcPr>
-            <w:tcW w:type="dxa" w:w="3360"/>
+            <w:tcW w:type="dxa" w:w="2484"/>
           </w:tcPr>
           <w:p>
             <w:r>
-              <w:t>EF Core, repositories, persistence</w:t>
+              <w:t>18–20 Oct 2026 (proposed)</w:t>
             </w:r>
           </w:p>
         </w:tc>
         <w:tc>
           <w:tcPr>
-            <w:tcW w:type="dxa" w:w="3360"/>
+            <w:tcW w:type="dxa" w:w="2484"/>
           </w:tcPr>
           <w:p>
             <w:r>
-              <w:t>Database queries and transactions</w:t>
+              <w:t>Stakeholders, user stories/use cases, functional and non-functional requirements</w:t>
+            </w:r>
+          </w:p>
+        </w:tc>
+        <w:tc>
+          <w:tcPr>
+            <w:tcW w:type="dxa" w:w="2484"/>
+          </w:tcPr>
+          <w:p>
+            <w:r>
+              <w:t>Team discussion</w:t>
             </w:r>
           </w:p>
         </w:tc>
@@ -492,31 +402,41 @@
       <w:tr>
         <w:tc>
           <w:tcPr>
-            <w:tcW w:type="dxa" w:w="3360"/>
+            <w:tcW w:type="dxa" w:w="2484"/>
           </w:tcPr>
           <w:p>
             <w:r>
-              <w:t>Repository</w:t>
+              <w:t>System Analysis &amp; Design</w:t>
             </w:r>
           </w:p>
         </w:tc>
         <w:tc>
           <w:tcPr>
-            <w:tcW w:type="dxa" w:w="3360"/>
+            <w:tcW w:type="dxa" w:w="2484"/>
           </w:tcPr>
           <w:p>
             <w:r>
-              <w:t>Abstracts data access</w:t>
+              <w:t>After requirements approval</w:t>
             </w:r>
           </w:p>
         </w:tc>
         <w:tc>
           <w:tcPr>
-            <w:tcW w:type="dxa" w:w="3360"/>
+            <w:tcW w:type="dxa" w:w="2484"/>
           </w:tcPr>
           <w:p>
             <w:r>
-              <w:t>Keep service logic independent of query implementation</w:t>
+              <w:t>ERD, architecture, required diagrams, wireframes</w:t>
+            </w:r>
+          </w:p>
+        </w:tc>
+        <w:tc>
+          <w:tcPr>
+            <w:tcW w:type="dxa" w:w="2484"/>
+          </w:tcPr>
+          <w:p>
+            <w:r>
+              <w:t>Approved requirements</w:t>
             </w:r>
           </w:p>
         </w:tc>
@@ -524,31 +444,41 @@
       <w:tr>
         <w:tc>
           <w:tcPr>
-            <w:tcW w:type="dxa" w:w="3360"/>
+            <w:tcW w:type="dxa" w:w="2484"/>
           </w:tcPr>
           <w:p>
             <w:r>
-              <w:t>Unit of Work</w:t>
+              <w:t>MVP implementation</w:t>
             </w:r>
           </w:p>
         </w:tc>
         <w:tc>
           <w:tcPr>
-            <w:tcW w:type="dxa" w:w="3360"/>
+            <w:tcW w:type="dxa" w:w="2484"/>
           </w:tcPr>
           <w:p>
             <w:r>
-              <w:t>Groups related data changes</w:t>
+              <w:t>After design approval</w:t>
             </w:r>
           </w:p>
         </w:tc>
         <w:tc>
           <w:tcPr>
-            <w:tcW w:type="dxa" w:w="3360"/>
+            <w:tcW w:type="dxa" w:w="2484"/>
           </w:tcPr>
           <w:p>
             <w:r>
-              <w:t>Use where multiple changes must commit together</w:t>
+              <w:t>Working authentication, projects, tasks, Kanban basics</w:t>
+            </w:r>
+          </w:p>
+        </w:tc>
+        <w:tc>
+          <w:tcPr>
+            <w:tcW w:type="dxa" w:w="2484"/>
+          </w:tcPr>
+          <w:p>
+            <w:r>
+              <w:t>Development environment and database</w:t>
             </w:r>
           </w:p>
         </w:tc>
@@ -556,95 +486,41 @@
       <w:tr>
         <w:tc>
           <w:tcPr>
-            <w:tcW w:type="dxa" w:w="3360"/>
+            <w:tcW w:type="dxa" w:w="2484"/>
           </w:tcPr>
           <w:p>
             <w:r>
-              <w:t>State</w:t>
+              <w:t>Testing and final documentation</w:t>
             </w:r>
           </w:p>
         </w:tc>
         <w:tc>
           <w:tcPr>
-            <w:tcW w:type="dxa" w:w="3360"/>
+            <w:tcW w:type="dxa" w:w="2484"/>
           </w:tcPr>
           <w:p>
             <w:r>
-              <w:t>Controls valid task status transitions</w:t>
+              <w:t>Before final submission</w:t>
             </w:r>
           </w:p>
         </w:tc>
         <w:tc>
           <w:tcPr>
-            <w:tcW w:type="dxa" w:w="3360"/>
+            <w:tcW w:type="dxa" w:w="2484"/>
           </w:tcPr>
           <w:p>
             <w:r>
-              <w:t>Prevent invalid status changes</w:t>
-            </w:r>
-          </w:p>
-        </w:tc>
-      </w:tr>
-      <w:tr>
-        <w:tc>
-          <w:tcPr>
-            <w:tcW w:type="dxa" w:w="3360"/>
-          </w:tcPr>
-          <w:p>
-            <w:r>
-              <w:t>Command</w:t>
+              <w:t>Test evidence, bug log, technical/user documentation, presentation</w:t>
             </w:r>
           </w:p>
         </w:tc>
         <w:tc>
           <w:tcPr>
-            <w:tcW w:type="dxa" w:w="3360"/>
+            <w:tcW w:type="dxa" w:w="2484"/>
           </w:tcPr>
           <w:p>
             <w:r>
-              <w:t>Encapsulates reversible actions</w:t>
-            </w:r>
-          </w:p>
-        </w:tc>
-        <w:tc>
-          <w:tcPr>
-            <w:tcW w:type="dxa" w:w="3360"/>
-          </w:tcPr>
-          <w:p>
-            <w:r>
-              <w:t>Optional later feature for undo/redo</w:t>
-            </w:r>
-          </w:p>
-        </w:tc>
-      </w:tr>
-      <w:tr>
-        <w:tc>
-          <w:tcPr>
-            <w:tcW w:type="dxa" w:w="3360"/>
-          </w:tcPr>
-          <w:p>
-            <w:r>
-              <w:t>Dependency Injection</w:t>
-            </w:r>
-          </w:p>
-        </w:tc>
-        <w:tc>
-          <w:tcPr>
-            <w:tcW w:type="dxa" w:w="3360"/>
-          </w:tcPr>
-          <w:p>
-            <w:r>
-              <w:t>Provides dependencies to components</w:t>
-            </w:r>
-          </w:p>
-        </w:tc>
-        <w:tc>
-          <w:tcPr>
-            <w:tcW w:type="dxa" w:w="3360"/>
-          </w:tcPr>
-          <w:p>
-            <w:r>
-              <w:t>Register services and repositories in ASP.NET Core</w:t>
+              <w:t>Working build and confirmed rubric</w:t>
             </w:r>
           </w:p>
         </w:tc>
@@ -655,384 +531,12 @@
         <w:pStyle w:val="Heading1"/>
       </w:pPr>
       <w:r>
-        <w:t>7. Work Plan and Proposed Schedule</w:t>
+        <w:t>1.3 Task Assignment &amp; Roles</w:t>
       </w:r>
     </w:p>
     <w:p>
       <w:r>
-        <w:t>The dates below are a proposed recovery plan prepared on 17 October 2026 because the dates shown in the supplied schedule (16 October 2026) have passed. Confirm revised deadlines with the supervisor before treating these dates as official.</w:t>
-      </w:r>
-    </w:p>
-    <w:tbl>
-      <w:tblPr>
-        <w:tblStyle w:val="TableGrid"/>
-        <w:tblW w:type="auto" w:w="0"/>
-        <w:jc w:val="center"/>
-        <w:tblLook w:firstColumn="1" w:firstRow="1" w:lastColumn="0" w:lastRow="0" w:noHBand="0" w:noVBand="1" w:val="04A0"/>
-      </w:tblPr>
-      <w:tblGrid>
-        <w:gridCol w:w="2520"/>
-        <w:gridCol w:w="2520"/>
-        <w:gridCol w:w="2520"/>
-        <w:gridCol w:w="2520"/>
-      </w:tblGrid>
-      <w:tr>
-        <w:tc>
-          <w:tcPr>
-            <w:tcW w:type="dxa" w:w="2520"/>
-            <w:shd w:fill="D9EAF7"/>
-          </w:tcPr>
-          <w:p>
-            <w:r>
-              <w:t>Work package</w:t>
-            </w:r>
-          </w:p>
-        </w:tc>
-        <w:tc>
-          <w:tcPr>
-            <w:tcW w:type="dxa" w:w="2520"/>
-            <w:shd w:fill="D9EAF7"/>
-          </w:tcPr>
-          <w:p>
-            <w:r>
-              <w:t>Proposed dates</w:t>
-            </w:r>
-          </w:p>
-        </w:tc>
-        <w:tc>
-          <w:tcPr>
-            <w:tcW w:type="dxa" w:w="2520"/>
-            <w:shd w:fill="D9EAF7"/>
-          </w:tcPr>
-          <w:p>
-            <w:r>
-              <w:t>Output</w:t>
-            </w:r>
-          </w:p>
-        </w:tc>
-        <w:tc>
-          <w:tcPr>
-            <w:tcW w:type="dxa" w:w="2520"/>
-            <w:shd w:fill="D9EAF7"/>
-          </w:tcPr>
-          <w:p>
-            <w:r>
-              <w:t>Dependency</w:t>
-            </w:r>
-          </w:p>
-        </w:tc>
-      </w:tr>
-      <w:tr>
-        <w:tc>
-          <w:tcPr>
-            <w:tcW w:type="dxa" w:w="2520"/>
-          </w:tcPr>
-          <w:p>
-            <w:r>
-              <w:t>Planning &amp; management</w:t>
-            </w:r>
-          </w:p>
-        </w:tc>
-        <w:tc>
-          <w:tcPr>
-            <w:tcW w:type="dxa" w:w="2520"/>
-          </w:tcPr>
-          <w:p>
-            <w:r>
-              <w:t>17–18 Oct 2026</w:t>
-            </w:r>
-          </w:p>
-        </w:tc>
-        <w:tc>
-          <w:tcPr>
-            <w:tcW w:type="dxa" w:w="2520"/>
-          </w:tcPr>
-          <w:p>
-            <w:r>
-              <w:t>Proposal, scope, work plan, risks, KPIs</w:t>
-            </w:r>
-          </w:p>
-        </w:tc>
-        <w:tc>
-          <w:tcPr>
-            <w:tcW w:type="dxa" w:w="2520"/>
-          </w:tcPr>
-          <w:p>
-            <w:r>
-              <w:t>None</w:t>
-            </w:r>
-          </w:p>
-        </w:tc>
-      </w:tr>
-      <w:tr>
-        <w:tc>
-          <w:tcPr>
-            <w:tcW w:type="dxa" w:w="2520"/>
-          </w:tcPr>
-          <w:p>
-            <w:r>
-              <w:t>Literature review</w:t>
-            </w:r>
-          </w:p>
-        </w:tc>
-        <w:tc>
-          <w:tcPr>
-            <w:tcW w:type="dxa" w:w="2520"/>
-          </w:tcPr>
-          <w:p>
-            <w:r>
-              <w:t>17–19 Oct 2026</w:t>
-            </w:r>
-          </w:p>
-        </w:tc>
-        <w:tc>
-          <w:tcPr>
-            <w:tcW w:type="dxa" w:w="2520"/>
-          </w:tcPr>
-          <w:p>
-            <w:r>
-              <w:t>Comparison of similar tools and design implications</w:t>
-            </w:r>
-          </w:p>
-        </w:tc>
-        <w:tc>
-          <w:tcPr>
-            <w:tcW w:type="dxa" w:w="2520"/>
-          </w:tcPr>
-          <w:p>
-            <w:r>
-              <w:t>Project concept</w:t>
-            </w:r>
-          </w:p>
-        </w:tc>
-      </w:tr>
-      <w:tr>
-        <w:tc>
-          <w:tcPr>
-            <w:tcW w:type="dxa" w:w="2520"/>
-          </w:tcPr>
-          <w:p>
-            <w:r>
-              <w:t>Requirements gathering</w:t>
-            </w:r>
-          </w:p>
-        </w:tc>
-        <w:tc>
-          <w:tcPr>
-            <w:tcW w:type="dxa" w:w="2520"/>
-          </w:tcPr>
-          <w:p>
-            <w:r>
-              <w:t>18–20 Oct 2026</w:t>
-            </w:r>
-          </w:p>
-        </w:tc>
-        <w:tc>
-          <w:tcPr>
-            <w:tcW w:type="dxa" w:w="2520"/>
-          </w:tcPr>
-          <w:p>
-            <w:r>
-              <w:t>Requirements, user stories, use cases</w:t>
-            </w:r>
-          </w:p>
-        </w:tc>
-        <w:tc>
-          <w:tcPr>
-            <w:tcW w:type="dxa" w:w="2520"/>
-          </w:tcPr>
-          <w:p>
-            <w:r>
-              <w:t>Project scope</w:t>
-            </w:r>
-          </w:p>
-        </w:tc>
-      </w:tr>
-      <w:tr>
-        <w:tc>
-          <w:tcPr>
-            <w:tcW w:type="dxa" w:w="2520"/>
-          </w:tcPr>
-          <w:p>
-            <w:r>
-              <w:t>System analysis &amp; design</w:t>
-            </w:r>
-          </w:p>
-        </w:tc>
-        <w:tc>
-          <w:tcPr>
-            <w:tcW w:type="dxa" w:w="2520"/>
-          </w:tcPr>
-          <w:p>
-            <w:r>
-              <w:t>21–25 Oct 2026</w:t>
-            </w:r>
-          </w:p>
-        </w:tc>
-        <w:tc>
-          <w:tcPr>
-            <w:tcW w:type="dxa" w:w="2520"/>
-          </w:tcPr>
-          <w:p>
-            <w:r>
-              <w:t>ERD, architecture, UML/DFD, wireframes</w:t>
-            </w:r>
-          </w:p>
-        </w:tc>
-        <w:tc>
-          <w:tcPr>
-            <w:tcW w:type="dxa" w:w="2520"/>
-          </w:tcPr>
-          <w:p>
-            <w:r>
-              <w:t>Requirements</w:t>
-            </w:r>
-          </w:p>
-        </w:tc>
-      </w:tr>
-      <w:tr>
-        <w:tc>
-          <w:tcPr>
-            <w:tcW w:type="dxa" w:w="2520"/>
-          </w:tcPr>
-          <w:p>
-            <w:r>
-              <w:t>MVP implementation</w:t>
-            </w:r>
-          </w:p>
-        </w:tc>
-        <w:tc>
-          <w:tcPr>
-            <w:tcW w:type="dxa" w:w="2520"/>
-          </w:tcPr>
-          <w:p>
-            <w:r>
-              <w:t>26 Oct–15 Nov 2026</w:t>
-            </w:r>
-          </w:p>
-        </w:tc>
-        <w:tc>
-          <w:tcPr>
-            <w:tcW w:type="dxa" w:w="2520"/>
-          </w:tcPr>
-          <w:p>
-            <w:r>
-              <w:t>Authentication, projects, tasks, Kanban basics</w:t>
-            </w:r>
-          </w:p>
-        </w:tc>
-        <w:tc>
-          <w:tcPr>
-            <w:tcW w:type="dxa" w:w="2520"/>
-          </w:tcPr>
-          <w:p>
-            <w:r>
-              <w:t>Design</w:t>
-            </w:r>
-          </w:p>
-        </w:tc>
-      </w:tr>
-      <w:tr>
-        <w:tc>
-          <w:tcPr>
-            <w:tcW w:type="dxa" w:w="2520"/>
-          </w:tcPr>
-          <w:p>
-            <w:r>
-              <w:t>Testing and improvements</w:t>
-            </w:r>
-          </w:p>
-        </w:tc>
-        <w:tc>
-          <w:tcPr>
-            <w:tcW w:type="dxa" w:w="2520"/>
-          </w:tcPr>
-          <w:p>
-            <w:r>
-              <w:t>16–22 Nov 2026</w:t>
-            </w:r>
-          </w:p>
-        </w:tc>
-        <w:tc>
-          <w:tcPr>
-            <w:tcW w:type="dxa" w:w="2520"/>
-          </w:tcPr>
-          <w:p>
-            <w:r>
-              <w:t>Test cases, bug log, fixes</w:t>
-            </w:r>
-          </w:p>
-        </w:tc>
-        <w:tc>
-          <w:tcPr>
-            <w:tcW w:type="dxa" w:w="2520"/>
-          </w:tcPr>
-          <w:p>
-            <w:r>
-              <w:t>MVP</w:t>
-            </w:r>
-          </w:p>
-        </w:tc>
-      </w:tr>
-      <w:tr>
-        <w:tc>
-          <w:tcPr>
-            <w:tcW w:type="dxa" w:w="2520"/>
-          </w:tcPr>
-          <w:p>
-            <w:r>
-              <w:t>Advanced features and deployment</w:t>
-            </w:r>
-          </w:p>
-        </w:tc>
-        <w:tc>
-          <w:tcPr>
-            <w:tcW w:type="dxa" w:w="2520"/>
-          </w:tcPr>
-          <w:p>
-            <w:r>
-              <w:t>23 Nov–4 Dec 2026</w:t>
-            </w:r>
-          </w:p>
-        </w:tc>
-        <w:tc>
-          <w:tcPr>
-            <w:tcW w:type="dxa" w:w="2520"/>
-          </w:tcPr>
-          <w:p>
-            <w:r>
-              <w:t>Selected advanced features, deployment/demo, final docs</w:t>
-            </w:r>
-          </w:p>
-        </w:tc>
-        <w:tc>
-          <w:tcPr>
-            <w:tcW w:type="dxa" w:w="2520"/>
-          </w:tcPr>
-          <w:p>
-            <w:r>
-              <w:t>Stable MVP</w:t>
-            </w:r>
-          </w:p>
-        </w:tc>
-      </w:tr>
-    </w:tbl>
-    <w:p>
-      <w:r>
-        <w:t>This schedule is indicative, not an approved DEPI deadline. At 10 hours per week, reduce the advanced scope if the team size or available hours do not support it.</w:t>
-      </w:r>
-    </w:p>
-    <w:p>
-      <w:pPr>
-        <w:pStyle w:val="Heading1"/>
-      </w:pPr>
-      <w:r>
-        <w:t>8. Team Roles (to be agreed)</w:t>
-      </w:r>
-    </w:p>
-    <w:p>
-      <w:r>
-        <w:t>No member assignments have been confirmed yet. Use the table below during the first team meeting; one person may hold more than one role in a small team.</w:t>
+        <w:t>Team members have not yet been assigned. Agree on the names and responsibilities in a team meeting. One person may cover more than one role if the team is small.</w:t>
       </w:r>
     </w:p>
     <w:tbl>
@@ -1042,25 +546,25 @@
         <w:tblLook w:firstColumn="1" w:firstRow="1" w:lastColumn="0" w:lastRow="0" w:noHBand="0" w:noVBand="1" w:val="04A0"/>
       </w:tblPr>
       <w:tblGrid>
-        <w:gridCol w:w="3360"/>
-        <w:gridCol w:w="3360"/>
-        <w:gridCol w:w="3360"/>
+        <w:gridCol w:w="3312"/>
+        <w:gridCol w:w="3312"/>
+        <w:gridCol w:w="3312"/>
       </w:tblGrid>
       <w:tr>
         <w:tc>
           <w:tcPr>
-            <w:tcW w:type="dxa" w:w="3360"/>
+            <w:tcW w:type="dxa" w:w="3312"/>
             <w:shd w:fill="D9EAF7"/>
           </w:tcPr>
           <w:p>
             <w:r>
-              <w:t>Role</w:t>
+              <w:t>Proposed role</w:t>
             </w:r>
           </w:p>
         </w:tc>
         <w:tc>
           <w:tcPr>
-            <w:tcW w:type="dxa" w:w="3360"/>
+            <w:tcW w:type="dxa" w:w="3312"/>
             <w:shd w:fill="D9EAF7"/>
           </w:tcPr>
           <w:p>
@@ -1071,7 +575,7 @@
         </w:tc>
         <w:tc>
           <w:tcPr>
-            <w:tcW w:type="dxa" w:w="3360"/>
+            <w:tcW w:type="dxa" w:w="3312"/>
             <w:shd w:fill="D9EAF7"/>
           </w:tcPr>
           <w:p>
@@ -1084,7 +588,7 @@
       <w:tr>
         <w:tc>
           <w:tcPr>
-            <w:tcW w:type="dxa" w:w="3360"/>
+            <w:tcW w:type="dxa" w:w="3312"/>
           </w:tcPr>
           <w:p>
             <w:r>
@@ -1094,17 +598,17 @@
         </w:tc>
         <w:tc>
           <w:tcPr>
-            <w:tcW w:type="dxa" w:w="3360"/>
+            <w:tcW w:type="dxa" w:w="3312"/>
           </w:tcPr>
           <w:p>
             <w:r>
-              <w:t>Schedule, meetings, scope, submission checklist</w:t>
+              <w:t>Track schedule, meetings, deliverables, and communication with supervisor</w:t>
             </w:r>
           </w:p>
         </w:tc>
         <w:tc>
           <w:tcPr>
-            <w:tcW w:type="dxa" w:w="3360"/>
+            <w:tcW w:type="dxa" w:w="3312"/>
           </w:tcPr>
           <w:p>
             <w:r>
@@ -1116,7 +620,7 @@
       <w:tr>
         <w:tc>
           <w:tcPr>
-            <w:tcW w:type="dxa" w:w="3360"/>
+            <w:tcW w:type="dxa" w:w="3312"/>
           </w:tcPr>
           <w:p>
             <w:r>
@@ -1126,17 +630,17 @@
         </w:tc>
         <w:tc>
           <w:tcPr>
-            <w:tcW w:type="dxa" w:w="3360"/>
+            <w:tcW w:type="dxa" w:w="3312"/>
           </w:tcPr>
           <w:p>
             <w:r>
-              <w:t>MVC, services, business rules, patterns</w:t>
+              <w:t>ASP.NET Core MVC, service logic, architecture and design patterns</w:t>
             </w:r>
           </w:p>
         </w:tc>
         <w:tc>
           <w:tcPr>
-            <w:tcW w:type="dxa" w:w="3360"/>
+            <w:tcW w:type="dxa" w:w="3312"/>
           </w:tcPr>
           <w:p>
             <w:r>
@@ -1148,7 +652,7 @@
       <w:tr>
         <w:tc>
           <w:tcPr>
-            <w:tcW w:type="dxa" w:w="3360"/>
+            <w:tcW w:type="dxa" w:w="3312"/>
           </w:tcPr>
           <w:p>
             <w:r>
@@ -1158,17 +662,17 @@
         </w:tc>
         <w:tc>
           <w:tcPr>
-            <w:tcW w:type="dxa" w:w="3360"/>
+            <w:tcW w:type="dxa" w:w="3312"/>
           </w:tcPr>
           <w:p>
             <w:r>
-              <w:t>ERD, EF Core, repositories, migrations</w:t>
+              <w:t>ERD, EF Core, repositories, migrations and database integrity</w:t>
             </w:r>
           </w:p>
         </w:tc>
         <w:tc>
           <w:tcPr>
-            <w:tcW w:type="dxa" w:w="3360"/>
+            <w:tcW w:type="dxa" w:w="3312"/>
           </w:tcPr>
           <w:p>
             <w:r>
@@ -1180,27 +684,27 @@
       <w:tr>
         <w:tc>
           <w:tcPr>
-            <w:tcW w:type="dxa" w:w="3360"/>
+            <w:tcW w:type="dxa" w:w="3312"/>
           </w:tcPr>
           <w:p>
             <w:r>
-              <w:t>UI / frontend</w:t>
+              <w:t>Frontend / UI</w:t>
             </w:r>
           </w:p>
         </w:tc>
         <w:tc>
           <w:tcPr>
-            <w:tcW w:type="dxa" w:w="3360"/>
+            <w:tcW w:type="dxa" w:w="3312"/>
           </w:tcPr>
           <w:p>
             <w:r>
-              <w:t>Views, Bootstrap, Kanban interactions</w:t>
+              <w:t>Views, Bootstrap, forms, Kanban interaction and responsive layout</w:t>
             </w:r>
           </w:p>
         </w:tc>
         <w:tc>
           <w:tcPr>
-            <w:tcW w:type="dxa" w:w="3360"/>
+            <w:tcW w:type="dxa" w:w="3312"/>
           </w:tcPr>
           <w:p>
             <w:r>
@@ -1212,7 +716,7 @@
       <w:tr>
         <w:tc>
           <w:tcPr>
-            <w:tcW w:type="dxa" w:w="3360"/>
+            <w:tcW w:type="dxa" w:w="3312"/>
           </w:tcPr>
           <w:p>
             <w:r>
@@ -1222,17 +726,17 @@
         </w:tc>
         <w:tc>
           <w:tcPr>
-            <w:tcW w:type="dxa" w:w="3360"/>
+            <w:tcW w:type="dxa" w:w="3312"/>
           </w:tcPr>
           <w:p>
             <w:r>
-              <w:t>Test cases, bug log, diagrams, user guide</w:t>
+              <w:t>Test cases, defect log, diagrams, README, user guide and presentation</w:t>
             </w:r>
           </w:p>
         </w:tc>
         <w:tc>
           <w:tcPr>
-            <w:tcW w:type="dxa" w:w="3360"/>
+            <w:tcW w:type="dxa" w:w="3312"/>
           </w:tcPr>
           <w:p>
             <w:r>
@@ -1247,7 +751,7 @@
         <w:pStyle w:val="Heading1"/>
       </w:pPr>
       <w:r>
-        <w:t>9. Risk Assessment and Mitigation</w:t>
+        <w:t>1.4 Risk Assessment &amp; Mitigation Plan</w:t>
       </w:r>
     </w:p>
     <w:tbl>
@@ -1257,14 +761,14 @@
         <w:tblLook w:firstColumn="1" w:firstRow="1" w:lastColumn="0" w:lastRow="0" w:noHBand="0" w:noVBand="1" w:val="04A0"/>
       </w:tblPr>
       <w:tblGrid>
-        <w:gridCol w:w="3360"/>
-        <w:gridCol w:w="3360"/>
-        <w:gridCol w:w="3360"/>
+        <w:gridCol w:w="3312"/>
+        <w:gridCol w:w="3312"/>
+        <w:gridCol w:w="3312"/>
       </w:tblGrid>
       <w:tr>
         <w:tc>
           <w:tcPr>
-            <w:tcW w:type="dxa" w:w="3360"/>
+            <w:tcW w:type="dxa" w:w="3312"/>
             <w:shd w:fill="D9EAF7"/>
           </w:tcPr>
           <w:p>
@@ -1275,18 +779,18 @@
         </w:tc>
         <w:tc>
           <w:tcPr>
-            <w:tcW w:type="dxa" w:w="3360"/>
+            <w:tcW w:type="dxa" w:w="3312"/>
             <w:shd w:fill="D9EAF7"/>
           </w:tcPr>
           <w:p>
             <w:r>
-              <w:t>Impact</w:t>
+              <w:t>Potential impact</w:t>
             </w:r>
           </w:p>
         </w:tc>
         <w:tc>
           <w:tcPr>
-            <w:tcW w:type="dxa" w:w="3360"/>
+            <w:tcW w:type="dxa" w:w="3312"/>
             <w:shd w:fill="D9EAF7"/>
           </w:tcPr>
           <w:p>
@@ -1299,31 +803,31 @@
       <w:tr>
         <w:tc>
           <w:tcPr>
-            <w:tcW w:type="dxa" w:w="3360"/>
+            <w:tcW w:type="dxa" w:w="3312"/>
           </w:tcPr>
           <w:p>
             <w:r>
-              <w:t>Scope too large for available time</w:t>
+              <w:t>Project scope is too large for the available time</w:t>
             </w:r>
           </w:p>
         </w:tc>
         <w:tc>
           <w:tcPr>
-            <w:tcW w:type="dxa" w:w="3360"/>
+            <w:tcW w:type="dxa" w:w="3312"/>
           </w:tcPr>
           <w:p>
             <w:r>
-              <w:t>High</w:t>
+              <w:t>Core features may remain unfinished</w:t>
             </w:r>
           </w:p>
         </w:tc>
         <w:tc>
           <w:tcPr>
-            <w:tcW w:type="dxa" w:w="3360"/>
+            <w:tcW w:type="dxa" w:w="3312"/>
           </w:tcPr>
           <w:p>
             <w:r>
-              <w:t>Deliver MVP first; make advanced features optional.</w:t>
+              <w:t>Prioritize a tested MVP; defer advanced features until core workflows work.</w:t>
             </w:r>
           </w:p>
         </w:tc>
@@ -1331,31 +835,31 @@
       <w:tr>
         <w:tc>
           <w:tcPr>
-            <w:tcW w:type="dxa" w:w="3360"/>
+            <w:tcW w:type="dxa" w:w="3312"/>
           </w:tcPr>
           <w:p>
             <w:r>
-              <w:t>Team responsibilities unclear</w:t>
+              <w:t>Roles are not assigned clearly</w:t>
             </w:r>
           </w:p>
         </w:tc>
         <w:tc>
           <w:tcPr>
-            <w:tcW w:type="dxa" w:w="3360"/>
+            <w:tcW w:type="dxa" w:w="3312"/>
           </w:tcPr>
           <w:p>
             <w:r>
-              <w:t>High</w:t>
+              <w:t>Duplicate work or missed deliverables</w:t>
             </w:r>
           </w:p>
         </w:tc>
         <w:tc>
           <w:tcPr>
-            <w:tcW w:type="dxa" w:w="3360"/>
+            <w:tcW w:type="dxa" w:w="3312"/>
           </w:tcPr>
           <w:p>
             <w:r>
-              <w:t>Agree owners, due dates, and acceptance criteria in the first meeting.</w:t>
+              <w:t>Assign an owner and due date to every task; review progress regularly.</w:t>
             </w:r>
           </w:p>
         </w:tc>
@@ -1363,31 +867,31 @@
       <w:tr>
         <w:tc>
           <w:tcPr>
-            <w:tcW w:type="dxa" w:w="3360"/>
+            <w:tcW w:type="dxa" w:w="3312"/>
           </w:tcPr>
           <w:p>
             <w:r>
-              <w:t>Merge conflicts / lost work</w:t>
+              <w:t>Late changes to database design</w:t>
             </w:r>
           </w:p>
         </w:tc>
         <w:tc>
           <w:tcPr>
-            <w:tcW w:type="dxa" w:w="3360"/>
+            <w:tcW w:type="dxa" w:w="3312"/>
           </w:tcPr>
           <w:p>
             <w:r>
-              <w:t>Medium</w:t>
+              <w:t>Rework and broken functionality</w:t>
             </w:r>
           </w:p>
         </w:tc>
         <w:tc>
           <w:tcPr>
-            <w:tcW w:type="dxa" w:w="3360"/>
+            <w:tcW w:type="dxa" w:w="3312"/>
           </w:tcPr>
           <w:p>
             <w:r>
-              <w:t>Use Git branches, small commits, pull requests, and a shared README.</w:t>
+              <w:t>Review and approve the ERD before implementing many features; use EF Core migrations.</w:t>
             </w:r>
           </w:p>
         </w:tc>
@@ -1395,31 +899,31 @@
       <w:tr>
         <w:tc>
           <w:tcPr>
-            <w:tcW w:type="dxa" w:w="3360"/>
+            <w:tcW w:type="dxa" w:w="3312"/>
           </w:tcPr>
           <w:p>
             <w:r>
-              <w:t>Database design changes late</w:t>
+              <w:t>Git merge conflicts or lost work</w:t>
             </w:r>
           </w:p>
         </w:tc>
         <w:tc>
           <w:tcPr>
-            <w:tcW w:type="dxa" w:w="3360"/>
+            <w:tcW w:type="dxa" w:w="3312"/>
           </w:tcPr>
           <w:p>
             <w:r>
-              <w:t>Medium</w:t>
+              <w:t>Integration delays or lost changes</w:t>
             </w:r>
           </w:p>
         </w:tc>
         <w:tc>
           <w:tcPr>
-            <w:tcW w:type="dxa" w:w="3360"/>
+            <w:tcW w:type="dxa" w:w="3312"/>
           </w:tcPr>
           <w:p>
             <w:r>
-              <w:t>Review ERD before implementation and use EF Core migrations.</w:t>
+              <w:t>Use branches, small commits, pull requests, and a shared repository.</w:t>
             </w:r>
           </w:p>
         </w:tc>
@@ -1427,31 +931,31 @@
       <w:tr>
         <w:tc>
           <w:tcPr>
-            <w:tcW w:type="dxa" w:w="3360"/>
+            <w:tcW w:type="dxa" w:w="3312"/>
           </w:tcPr>
           <w:p>
             <w:r>
-              <w:t>Real-time/deployment complexity</w:t>
+              <w:t>Real-time and Azure features take longer than expected</w:t>
             </w:r>
           </w:p>
         </w:tc>
         <w:tc>
           <w:tcPr>
-            <w:tcW w:type="dxa" w:w="3360"/>
+            <w:tcW w:type="dxa" w:w="3312"/>
           </w:tcPr>
           <w:p>
             <w:r>
-              <w:t>Medium</w:t>
+              <w:t>Deployment delay</w:t>
             </w:r>
           </w:p>
         </w:tc>
         <w:tc>
           <w:tcPr>
-            <w:tcW w:type="dxa" w:w="3360"/>
+            <w:tcW w:type="dxa" w:w="3312"/>
           </w:tcPr>
           <w:p>
             <w:r>
-              <w:t>Build and test core workflows locally before SignalR/Azure.</w:t>
+              <w:t>Build and test locally first; treat advanced services as later milestones.</w:t>
             </w:r>
           </w:p>
         </w:tc>
@@ -1462,7 +966,227 @@
         <w:pStyle w:val="Heading1"/>
       </w:pPr>
       <w:r>
-        <w:t>10. Key Performance Indicators (KPIs)</w:t>
+        <w:t>1.5 KPIs (Key Performance Indicators)</w:t>
+      </w:r>
+    </w:p>
+    <w:p>
+      <w:r>
+        <w:t>The following are proposed project-success measures. The team should confirm target values after the scope and timeline are approved.</w:t>
+      </w:r>
+    </w:p>
+    <w:tbl>
+      <w:tblPr>
+        <w:tblStyle w:val="TableGrid"/>
+        <w:tblW w:type="auto" w:w="0"/>
+        <w:tblLook w:firstColumn="1" w:firstRow="1" w:lastColumn="0" w:lastRow="0" w:noHBand="0" w:noVBand="1" w:val="04A0"/>
+      </w:tblPr>
+      <w:tblGrid>
+        <w:gridCol w:w="3312"/>
+        <w:gridCol w:w="3312"/>
+        <w:gridCol w:w="3312"/>
+      </w:tblGrid>
+      <w:tr>
+        <w:tc>
+          <w:tcPr>
+            <w:tcW w:type="dxa" w:w="3312"/>
+            <w:shd w:fill="D9EAF7"/>
+          </w:tcPr>
+          <w:p>
+            <w:r>
+              <w:t>KPI</w:t>
+            </w:r>
+          </w:p>
+        </w:tc>
+        <w:tc>
+          <w:tcPr>
+            <w:tcW w:type="dxa" w:w="3312"/>
+            <w:shd w:fill="D9EAF7"/>
+          </w:tcPr>
+          <w:p>
+            <w:r>
+              <w:t>How it will be measured</w:t>
+            </w:r>
+          </w:p>
+        </w:tc>
+        <w:tc>
+          <w:tcPr>
+            <w:tcW w:type="dxa" w:w="3312"/>
+            <w:shd w:fill="D9EAF7"/>
+          </w:tcPr>
+          <w:p>
+            <w:r>
+              <w:t>Proposed target</w:t>
+            </w:r>
+          </w:p>
+        </w:tc>
+      </w:tr>
+      <w:tr>
+        <w:tc>
+          <w:tcPr>
+            <w:tcW w:type="dxa" w:w="3312"/>
+          </w:tcPr>
+          <w:p>
+            <w:r>
+              <w:t>MVP requirement completion</w:t>
+            </w:r>
+          </w:p>
+        </w:tc>
+        <w:tc>
+          <w:tcPr>
+            <w:tcW w:type="dxa" w:w="3312"/>
+          </w:tcPr>
+          <w:p>
+            <w:r>
+              <w:t>Number of agreed Must requirements passing acceptance tests</w:t>
+            </w:r>
+          </w:p>
+        </w:tc>
+        <w:tc>
+          <w:tcPr>
+            <w:tcW w:type="dxa" w:w="3312"/>
+          </w:tcPr>
+          <w:p>
+            <w:r>
+              <w:t>100% of approved MVP Must requirements</w:t>
+            </w:r>
+          </w:p>
+        </w:tc>
+      </w:tr>
+      <w:tr>
+        <w:tc>
+          <w:tcPr>
+            <w:tcW w:type="dxa" w:w="3312"/>
+          </w:tcPr>
+          <w:p>
+            <w:r>
+              <w:t>Critical defect count</w:t>
+            </w:r>
+          </w:p>
+        </w:tc>
+        <w:tc>
+          <w:tcPr>
+            <w:tcW w:type="dxa" w:w="3312"/>
+          </w:tcPr>
+          <w:p>
+            <w:r>
+              <w:t>Open critical defects during final test pass</w:t>
+            </w:r>
+          </w:p>
+        </w:tc>
+        <w:tc>
+          <w:tcPr>
+            <w:tcW w:type="dxa" w:w="3312"/>
+          </w:tcPr>
+          <w:p>
+            <w:r>
+              <w:t>0 open critical defects at final demo</w:t>
+            </w:r>
+          </w:p>
+        </w:tc>
+      </w:tr>
+      <w:tr>
+        <w:tc>
+          <w:tcPr>
+            <w:tcW w:type="dxa" w:w="3312"/>
+          </w:tcPr>
+          <w:p>
+            <w:r>
+              <w:t>Task workflow reliability</w:t>
+            </w:r>
+          </w:p>
+        </w:tc>
+        <w:tc>
+          <w:tcPr>
+            <w:tcW w:type="dxa" w:w="3312"/>
+          </w:tcPr>
+          <w:p>
+            <w:r>
+              <w:t>Create, edit, and move tasks; refresh and confirm saved data</w:t>
+            </w:r>
+          </w:p>
+        </w:tc>
+        <w:tc>
+          <w:tcPr>
+            <w:tcW w:type="dxa" w:w="3312"/>
+          </w:tcPr>
+          <w:p>
+            <w:r>
+              <w:t>All core workflow test cases pass</w:t>
+            </w:r>
+          </w:p>
+        </w:tc>
+      </w:tr>
+      <w:tr>
+        <w:tc>
+          <w:tcPr>
+            <w:tcW w:type="dxa" w:w="3312"/>
+          </w:tcPr>
+          <w:p>
+            <w:r>
+              <w:t>Deliverable completion</w:t>
+            </w:r>
+          </w:p>
+        </w:tc>
+        <w:tc>
+          <w:tcPr>
+            <w:tcW w:type="dxa" w:w="3312"/>
+          </w:tcPr>
+          <w:p>
+            <w:r>
+              <w:t>Required documents and artifacts completed and reviewed</w:t>
+            </w:r>
+          </w:p>
+        </w:tc>
+        <w:tc>
+          <w:tcPr>
+            <w:tcW w:type="dxa" w:w="3312"/>
+          </w:tcPr>
+          <w:p>
+            <w:r>
+              <w:t>All confirmed DEPI deliverables submitted</w:t>
+            </w:r>
+          </w:p>
+        </w:tc>
+      </w:tr>
+      <w:tr>
+        <w:tc>
+          <w:tcPr>
+            <w:tcW w:type="dxa" w:w="3312"/>
+          </w:tcPr>
+          <w:p>
+            <w:r>
+              <w:t>Team task ownership</w:t>
+            </w:r>
+          </w:p>
+        </w:tc>
+        <w:tc>
+          <w:tcPr>
+            <w:tcW w:type="dxa" w:w="3312"/>
+          </w:tcPr>
+          <w:p>
+            <w:r>
+              <w:t>Tasks with an owner and due date / total planned tasks</w:t>
+            </w:r>
+          </w:p>
+        </w:tc>
+        <w:tc>
+          <w:tcPr>
+            <w:tcW w:type="dxa" w:w="3312"/>
+          </w:tcPr>
+          <w:p>
+            <w:r>
+              <w:t>100% of planned tasks assigned</w:t>
+            </w:r>
+          </w:p>
+        </w:tc>
+      </w:tr>
+    </w:tbl>
+    <w:p>
+      <w:pPr>
+        <w:pStyle w:val="Heading1"/>
+      </w:pPr>
+      <w:r>
+        <w:t>Open Decisions</w:t>
       </w:r>
     </w:p>
     <w:p>
@@ -1470,7 +1194,7 @@
         <w:pStyle w:val="ListBullet"/>
       </w:pPr>
       <w:r>
-        <w:t>All agreed MVP user stories have an acceptance test and a recorded result.</w:t>
+        <w:t>Confirm updated submission dates with the DEPI supervisor.</w:t>
       </w:r>
     </w:p>
     <w:p>
@@ -1478,7 +1202,7 @@
         <w:pStyle w:val="ListBullet"/>
       </w:pPr>
       <w:r>
-        <w:t>A user can create a project and create/update/move tasks without data loss.</w:t>
+        <w:t>Confirm the team member names and assign roles.</w:t>
       </w:r>
     </w:p>
     <w:p>
@@ -1486,7 +1210,7 @@
         <w:pStyle w:val="ListBullet"/>
       </w:pPr>
       <w:r>
-        <w:t>No unresolved critical defects remain in the final MVP test pass.</w:t>
+        <w:t>Confirm which advanced features are mandatory for grading.</w:t>
       </w:r>
     </w:p>
     <w:p>
@@ -1494,148 +1218,12 @@
         <w:pStyle w:val="ListBullet"/>
       </w:pPr>
       <w:r>
-        <w:t>Each team member has an agreed task owner and due date in the shared task board.</w:t>
-      </w:r>
-    </w:p>
-    <w:p>
-      <w:pPr>
-        <w:pStyle w:val="ListBullet"/>
-      </w:pPr>
-      <w:r>
-        <w:t>Required project documents and source code are stored in the agreed GitHub repository.</w:t>
-      </w:r>
-    </w:p>
-    <w:p>
-      <w:pPr>
-        <w:pStyle w:val="Heading1"/>
-      </w:pPr>
-      <w:r>
-        <w:t>11. Deliverables Checklist</w:t>
-      </w:r>
-    </w:p>
-    <w:p>
-      <w:pPr>
-        <w:pStyle w:val="ListBullet"/>
-      </w:pPr>
-      <w:r>
-        <w:t>Project proposal and scope</w:t>
-      </w:r>
-    </w:p>
-    <w:p>
-      <w:pPr>
-        <w:pStyle w:val="ListBullet"/>
-      </w:pPr>
-      <w:r>
-        <w:t>Project schedule / Gantt chart</w:t>
-      </w:r>
-    </w:p>
-    <w:p>
-      <w:pPr>
-        <w:pStyle w:val="ListBullet"/>
-      </w:pPr>
-      <w:r>
-        <w:t>Team roles and risk register</w:t>
-      </w:r>
-    </w:p>
-    <w:p>
-      <w:pPr>
-        <w:pStyle w:val="ListBullet"/>
-      </w:pPr>
-      <w:r>
-        <w:t>Requirements document</w:t>
-      </w:r>
-    </w:p>
-    <w:p>
-      <w:pPr>
-        <w:pStyle w:val="ListBullet"/>
-      </w:pPr>
-      <w:r>
-        <w:t>System design diagrams</w:t>
-      </w:r>
-    </w:p>
-    <w:p>
-      <w:pPr>
-        <w:pStyle w:val="ListBullet"/>
-      </w:pPr>
-      <w:r>
-        <w:t>Source code repository and README</w:t>
-      </w:r>
-    </w:p>
-    <w:p>
-      <w:pPr>
-        <w:pStyle w:val="ListBullet"/>
-      </w:pPr>
-      <w:r>
-        <w:t>Test plan, test cases, and defect log</w:t>
-      </w:r>
-    </w:p>
-    <w:p>
-      <w:pPr>
-        <w:pStyle w:val="ListBullet"/>
-      </w:pPr>
-      <w:r>
-        <w:t>Technical documentation and user manual</w:t>
-      </w:r>
-    </w:p>
-    <w:p>
-      <w:pPr>
-        <w:pStyle w:val="ListBullet"/>
-      </w:pPr>
-      <w:r>
-        <w:t>Final presentation and demo</w:t>
-      </w:r>
-    </w:p>
-    <w:p>
-      <w:pPr>
-        <w:pStyle w:val="Heading1"/>
-      </w:pPr>
-      <w:r>
-        <w:t>12. Assumptions and Open Decisions</w:t>
-      </w:r>
-    </w:p>
-    <w:p>
-      <w:pPr>
-        <w:pStyle w:val="ListBullet"/>
-      </w:pPr>
-      <w:r>
-        <w:t>Team size and member names: not yet provided.</w:t>
-      </w:r>
-    </w:p>
-    <w:p>
-      <w:pPr>
-        <w:pStyle w:val="ListBullet"/>
-      </w:pPr>
-      <w:r>
-        <w:t>Exact supervisor-approved submission dates: must be confirmed.</w:t>
-      </w:r>
-    </w:p>
-    <w:p>
-      <w:pPr>
-        <w:pStyle w:val="ListBullet"/>
-      </w:pPr>
-      <w:r>
-        <w:t>Whether academic citations are mandatory for Literature Review: confirm with supervisor.</w:t>
-      </w:r>
-    </w:p>
-    <w:p>
-      <w:pPr>
-        <w:pStyle w:val="ListBullet"/>
-      </w:pPr>
-      <w:r>
-        <w:t>Database and Azure resource availability: confirm before deployment.</w:t>
-      </w:r>
-    </w:p>
-    <w:p>
-      <w:pPr>
-        <w:pStyle w:val="ListBullet"/>
-      </w:pPr>
-      <w:r>
-        <w:t>Final MVP feature list: approve with team and supervisor.</w:t>
+        <w:t>Confirm whether Azure deployment and academic references are required.</w:t>
       </w:r>
     </w:p>
     <w:sectPr>
       <w:pgSz w:w="12240" w:h="15840"/>
-      <w:pgMar w:top="1008" w:right="1080" w:bottom="1008" w:left="1080" w:header="720" w:footer="720" w:gutter="0"/>
+      <w:pgMar w:top="1008" w:right="1152" w:bottom="1008" w:left="1152" w:header="720" w:footer="720" w:gutter="0"/>
       <w:cols w:space="720"/>
       <w:docGrid w:linePitch="360"/>
     </w:sectPr>
@@ -2074,7 +1662,7 @@
       <w:b/>
       <w:bCs/>
       <w:color w:val="1F4E79"/>
-      <w:sz w:val="32"/>
+      <w:sz w:val="30"/>
       <w:szCs w:val="28"/>
     </w:rPr>
   </w:style>

</xml_diff>